<commit_message>
Add team names to the write-up and tidy the change list
Write-up (Word and PDF) now lists the team members and matric numbers.
Change list drops the "(new)" markers.

Co-Authored-By: Claude Opus 5.5 <noreply@anthropic.com>
</commit_message>
<xml_diff>
--- a/reports/CS3223_SimpleDB_Join_Experiments.docx
+++ b/reports/CS3223_SimpleDB_Join_Experiments.docx
@@ -13,13 +13,13 @@
     <w:p>
       <w:pPr/>
       <w:r>
+        <w:t xml:space="preserve">Joel Kalaivanan (A0291976J) · Jin Xunze (A0255453A) · Wang Xuxin (A0252982W)</w:t>
+      </w:r>
+    </w:p>
+    <w:p>
+      <w:pPr/>
+      <w:r>
         <w:t xml:space="preserve">Oct 23, 2026</w:t>
-      </w:r>
-      <w:r>
-        <w:t xml:space="preserve"> · </w:t>
-      </w:r>
-      <w:r>
-        <w:t xml:space="preserve">@Joel</w:t>
       </w:r>
     </w:p>
     <w:p>

</xml_diff>

<commit_message>
Add team names to the write-up and tidy the change list (#9)
Write-up (Word and PDF) now lists the team members and matric numbers.
Change list drops the "(new)" markers.

Co-authored-by: Claude Opus 5.5 <noreply@anthropic.com>
</commit_message>
<xml_diff>
--- a/reports/CS3223_SimpleDB_Join_Experiments.docx
+++ b/reports/CS3223_SimpleDB_Join_Experiments.docx
@@ -13,13 +13,13 @@
     <w:p>
       <w:pPr/>
       <w:r>
+        <w:t xml:space="preserve">Joel Kalaivanan (A0291976J) · Jin Xunze (A0255453A) · Wang Xuxin (A0252982W)</w:t>
+      </w:r>
+    </w:p>
+    <w:p>
+      <w:pPr/>
+      <w:r>
         <w:t xml:space="preserve">Oct 23, 2026</w:t>
-      </w:r>
-      <w:r>
-        <w:t xml:space="preserve"> · </w:t>
-      </w:r>
-      <w:r>
-        <w:t xml:space="preserve">@Joel</w:t>
       </w:r>
     </w:p>
     <w:p>

</xml_diff>

<commit_message>
Add the AI tool use declaration to the experiments write-up
The course AI policy requires every submission to declare how AI tools
were used. Section 5 lists it per part of the project. The Lab 1-4 rows
repeat the declarations in the submitted lab reports. The rest come from
the team's account of Labs 5-7 and the Claude co-author trailers on the
final-week commits.

The PDF is re-exported with LibreOffice 26.8.1, the version that made the
previous PDF. Pages 1-2 are unchanged and the report is still 3 pages.

Co-Authored-By: Claude Opus 5.5 <noreply@anthropic.com>
</commit_message>
<xml_diff>
--- a/reports/CS3223_SimpleDB_Join_Experiments.docx
+++ b/reports/CS3223_SimpleDB_Join_Experiments.docx
@@ -1369,6 +1369,460 @@
         <w:t xml:space="preserve"> Restricting to index joins also changed the join order. Plan A starts from DEPT (30 rows) and follows the two indexes, touching only matching rows. Plans B and C join DEPT and COURSE first, then STUDENT and ENROLL, so each step processes a larger intermediate result.</w:t>
       </w:r>
     </w:p>
+    <w:p>
+      <w:pPr>
+        <w:pStyle w:val="Heading1"/>
+      </w:pPr>
+      <w:r>
+        <w:t xml:space="preserve">5. Declaration of AI Tool Use</w:t>
+      </w:r>
+    </w:p>
+    <w:p>
+      <w:r>
+        <w:t xml:space="preserve">We used one AI tool, Claude by Anthropic, through Claude Code with the Claude Sonnet 5 and Claude Opus 5.5 models. Table 4 lists how we used it in each part of the project. The rows for Labs 1 to 4 repeat the declarations in our lab reports.</w:t>
+      </w:r>
+    </w:p>
+    <w:p>
+      <w:pPr>
+        <w:pStyle w:val="Caption"/>
+        <w:keepNext/>
+        <w:spacing w:after="60"/>
+      </w:pPr>
+      <w:r>
+        <w:t xml:space="preserve">Table 4: AI tool use by part of the project</w:t>
+      </w:r>
+    </w:p>
+    <w:tbl>
+      <w:tblPr>
+        <w:tblStyle w:val="TableGrid"/>
+        <w:tblW w:type="auto" w:w="0"/>
+        <w:jc w:val="left"/>
+        <w:tblLayout w:type="fixed"/>
+        <w:tblLook w:firstColumn="1" w:firstRow="1" w:lastColumn="0" w:lastRow="0" w:noHBand="0" w:noVBand="1" w:val="04A0"/>
+        <w:tblBorders>
+          <w:top w:val="single" w:sz="4" w:space="0" w:color="8EAADB"/>
+          <w:left w:val="single" w:sz="4" w:space="0" w:color="8EAADB"/>
+          <w:bottom w:val="single" w:sz="4" w:space="0" w:color="8EAADB"/>
+          <w:right w:val="single" w:sz="4" w:space="0" w:color="8EAADB"/>
+          <w:insideH w:val="single" w:sz="4" w:space="0" w:color="8EAADB"/>
+          <w:insideV w:val="single" w:sz="4" w:space="0" w:color="8EAADB"/>
+        </w:tblBorders>
+        <w:tblLayout w:type="fixed"/>
+      </w:tblPr>
+      <w:tblGrid>
+        <w:gridCol w:w="2268"/>
+        <w:gridCol w:w="6746"/>
+      </w:tblGrid>
+      <w:tr>
+        <w:trPr>
+          <w:tblHeader/>
+        </w:trPr>
+        <w:tc>
+          <w:tcPr>
+            <w:tcW w:type="dxa" w:w="2268"/>
+            <w:shd w:val="clear" w:color="auto" w:fill="D9E2F3"/>
+            <w:tcMar>
+              <w:top w:w="40" w:type="dxa"/>
+              <w:bottom w:w="40" w:type="dxa"/>
+            </w:tcMar>
+          </w:tcPr>
+          <w:p>
+            <w:pPr>
+              <w:spacing w:after="0" w:line="240" w:lineRule="auto"/>
+            </w:pPr>
+            <w:r>
+              <w:rPr>
+                <w:b/>
+                <w:sz w:val="20"/>
+              </w:rPr>
+              <w:t xml:space="preserve">Part of the project</w:t>
+            </w:r>
+          </w:p>
+        </w:tc>
+        <w:tc>
+          <w:tcPr>
+            <w:tcW w:type="dxa" w:w="6746"/>
+            <w:shd w:val="clear" w:color="auto" w:fill="D9E2F3"/>
+            <w:tcMar>
+              <w:top w:w="40" w:type="dxa"/>
+              <w:bottom w:w="40" w:type="dxa"/>
+            </w:tcMar>
+          </w:tcPr>
+          <w:p>
+            <w:pPr>
+              <w:spacing w:after="0" w:line="240" w:lineRule="auto"/>
+            </w:pPr>
+            <w:r>
+              <w:rPr>
+                <w:b/>
+                <w:sz w:val="20"/>
+              </w:rPr>
+              <w:t xml:space="preserve">How AI was used</w:t>
+            </w:r>
+          </w:p>
+        </w:tc>
+      </w:tr>
+      <w:tr>
+        <w:trPr>
+          <w:cantSplit/>
+        </w:trPr>
+        <w:tc>
+          <w:tcPr>
+            <w:tcW w:type="dxa" w:w="2268"/>
+            <w:tcMar>
+              <w:top w:w="40" w:type="dxa"/>
+              <w:bottom w:w="40" w:type="dxa"/>
+            </w:tcMar>
+          </w:tcPr>
+          <w:p>
+            <w:pPr>
+              <w:spacing w:after="0" w:line="240" w:lineRule="auto"/>
+            </w:pPr>
+            <w:r>
+              <w:rPr>
+                <w:sz w:val="20"/>
+              </w:rPr>
+              <w:t xml:space="preserve">Lab 1: non-equality predicates</w:t>
+            </w:r>
+          </w:p>
+        </w:tc>
+        <w:tc>
+          <w:tcPr>
+            <w:tcW w:type="dxa" w:w="6746"/>
+            <w:tcMar>
+              <w:top w:w="40" w:type="dxa"/>
+              <w:bottom w:w="40" w:type="dxa"/>
+            </w:tcMar>
+          </w:tcPr>
+          <w:p>
+            <w:pPr>
+              <w:spacing w:after="0" w:line="240" w:lineRule="auto"/>
+            </w:pPr>
+            <w:r>
+              <w:rPr>
+                <w:sz w:val="20"/>
+              </w:rPr>
+              <w:t xml:space="preserve">To understand what each file did and to help our ideation, to generate test cases that we ran by hand in SimpleIJ, and to format the report and change list.</w:t>
+            </w:r>
+          </w:p>
+        </w:tc>
+      </w:tr>
+      <w:tr>
+        <w:trPr>
+          <w:cantSplit/>
+        </w:trPr>
+        <w:tc>
+          <w:tcPr>
+            <w:tcW w:type="dxa" w:w="2268"/>
+            <w:tcMar>
+              <w:top w:w="40" w:type="dxa"/>
+              <w:bottom w:w="40" w:type="dxa"/>
+            </w:tcMar>
+          </w:tcPr>
+          <w:p>
+            <w:pPr>
+              <w:spacing w:after="0" w:line="240" w:lineRule="auto"/>
+            </w:pPr>
+            <w:r>
+              <w:rPr>
+                <w:sz w:val="20"/>
+              </w:rPr>
+              <w:t xml:space="preserve">Lab 2: hash and B-tree indexes</w:t>
+            </w:r>
+          </w:p>
+        </w:tc>
+        <w:tc>
+          <w:tcPr>
+            <w:tcW w:type="dxa" w:w="6746"/>
+            <w:tcMar>
+              <w:top w:w="40" w:type="dxa"/>
+              <w:bottom w:w="40" w:type="dxa"/>
+            </w:tcMar>
+          </w:tcPr>
+          <w:p>
+            <w:pPr>
+              <w:spacing w:after="0" w:line="240" w:lineRule="auto"/>
+            </w:pPr>
+            <w:r>
+              <w:rPr>
+                <w:sz w:val="20"/>
+              </w:rPr>
+              <w:t xml:space="preserve">To explore the existing index, catalog and planner code, and to help design how the index type is passed through the catalog. To generate IndexTypeTest and run the sample queries. To format the report and change list.</w:t>
+            </w:r>
+          </w:p>
+        </w:tc>
+      </w:tr>
+      <w:tr>
+        <w:trPr>
+          <w:cantSplit/>
+        </w:trPr>
+        <w:tc>
+          <w:tcPr>
+            <w:tcW w:type="dxa" w:w="2268"/>
+            <w:tcMar>
+              <w:top w:w="40" w:type="dxa"/>
+              <w:bottom w:w="40" w:type="dxa"/>
+            </w:tcMar>
+          </w:tcPr>
+          <w:p>
+            <w:pPr>
+              <w:spacing w:after="0" w:line="240" w:lineRule="auto"/>
+            </w:pPr>
+            <w:r>
+              <w:rPr>
+                <w:sz w:val="20"/>
+              </w:rPr>
+              <w:t xml:space="preserve">Lab 3: ORDER BY</w:t>
+            </w:r>
+          </w:p>
+        </w:tc>
+        <w:tc>
+          <w:tcPr>
+            <w:tcW w:type="dxa" w:w="6746"/>
+            <w:tcMar>
+              <w:top w:w="40" w:type="dxa"/>
+              <w:bottom w:w="40" w:type="dxa"/>
+            </w:tcMar>
+          </w:tcPr>
+          <w:p>
+            <w:pPr>
+              <w:spacing w:after="0" w:line="240" w:lineRule="auto"/>
+            </w:pPr>
+            <w:r>
+              <w:rPr>
+                <w:sz w:val="20"/>
+              </w:rPr>
+              <w:t xml:space="preserve">To help write OrderByTest and draft the report. The engine changes were made without AI.</w:t>
+            </w:r>
+          </w:p>
+        </w:tc>
+      </w:tr>
+      <w:tr>
+        <w:trPr>
+          <w:cantSplit/>
+        </w:trPr>
+        <w:tc>
+          <w:tcPr>
+            <w:tcW w:type="dxa" w:w="2268"/>
+            <w:tcMar>
+              <w:top w:w="40" w:type="dxa"/>
+              <w:bottom w:w="40" w:type="dxa"/>
+            </w:tcMar>
+          </w:tcPr>
+          <w:p>
+            <w:pPr>
+              <w:spacing w:after="0" w:line="240" w:lineRule="auto"/>
+            </w:pPr>
+            <w:r>
+              <w:rPr>
+                <w:sz w:val="20"/>
+              </w:rPr>
+              <w:t xml:space="preserve">Lab 4: join algorithms</w:t>
+            </w:r>
+          </w:p>
+        </w:tc>
+        <w:tc>
+          <w:tcPr>
+            <w:tcW w:type="dxa" w:w="6746"/>
+            <w:tcMar>
+              <w:top w:w="40" w:type="dxa"/>
+              <w:bottom w:w="40" w:type="dxa"/>
+            </w:tcMar>
+          </w:tcPr>
+          <w:p>
+            <w:pPr>
+              <w:spacing w:after="0" w:line="240" w:lineRule="auto"/>
+            </w:pPr>
+            <w:r>
+              <w:rPr>
+                <w:sz w:val="20"/>
+              </w:rPr>
+              <w:t xml:space="preserve">To help write JoinTest and CreateBigStudentDB and draft the report. The engine changes were made without AI.</w:t>
+            </w:r>
+          </w:p>
+        </w:tc>
+      </w:tr>
+      <w:tr>
+        <w:trPr>
+          <w:cantSplit/>
+        </w:trPr>
+        <w:tc>
+          <w:tcPr>
+            <w:tcW w:type="dxa" w:w="2268"/>
+            <w:tcMar>
+              <w:top w:w="40" w:type="dxa"/>
+              <w:bottom w:w="40" w:type="dxa"/>
+            </w:tcMar>
+          </w:tcPr>
+          <w:p>
+            <w:pPr>
+              <w:spacing w:after="0" w:line="240" w:lineRule="auto"/>
+            </w:pPr>
+            <w:r>
+              <w:rPr>
+                <w:sz w:val="20"/>
+              </w:rPr>
+              <w:t xml:space="preserve">Labs 5 to 7</w:t>
+            </w:r>
+          </w:p>
+        </w:tc>
+        <w:tc>
+          <w:tcPr>
+            <w:tcW w:type="dxa" w:w="6746"/>
+            <w:tcMar>
+              <w:top w:w="40" w:type="dxa"/>
+              <w:bottom w:w="40" w:type="dxa"/>
+            </w:tcMar>
+          </w:tcPr>
+          <w:p>
+            <w:pPr>
+              <w:spacing w:after="0" w:line="240" w:lineRule="auto"/>
+            </w:pPr>
+            <w:r>
+              <w:rPr>
+                <w:sz w:val="20"/>
+              </w:rPr>
+              <w:t xml:space="preserve">We wrote the code. AI was used to explain concepts, discuss approaches, and debug code we had written.</w:t>
+            </w:r>
+          </w:p>
+        </w:tc>
+      </w:tr>
+      <w:tr>
+        <w:trPr>
+          <w:cantSplit/>
+        </w:trPr>
+        <w:tc>
+          <w:tcPr>
+            <w:tcW w:type="dxa" w:w="2268"/>
+            <w:tcMar>
+              <w:top w:w="40" w:type="dxa"/>
+              <w:bottom w:w="40" w:type="dxa"/>
+            </w:tcMar>
+          </w:tcPr>
+          <w:p>
+            <w:pPr>
+              <w:spacing w:after="0" w:line="240" w:lineRule="auto"/>
+            </w:pPr>
+            <w:r>
+              <w:rPr>
+                <w:sz w:val="20"/>
+              </w:rPr>
+              <w:t xml:space="preserve">Final integration</w:t>
+            </w:r>
+          </w:p>
+        </w:tc>
+        <w:tc>
+          <w:tcPr>
+            <w:tcW w:type="dxa" w:w="6746"/>
+            <w:tcMar>
+              <w:top w:w="40" w:type="dxa"/>
+              <w:bottom w:w="40" w:type="dxa"/>
+            </w:tcMar>
+          </w:tcPr>
+          <w:p>
+            <w:pPr>
+              <w:spacing w:after="0" w:line="240" w:lineRule="auto"/>
+            </w:pPr>
+            <w:r>
+              <w:rPr>
+                <w:sz w:val="20"/>
+              </w:rPr>
+              <w:t xml:space="preserve">To help write two fixes found while testing: IndexJoinScan with an empty outer input, and SortPlan merging down to a single run. To help write JoinExperiments, the program that produced the timings in this report.</w:t>
+            </w:r>
+          </w:p>
+        </w:tc>
+      </w:tr>
+      <w:tr>
+        <w:trPr>
+          <w:cantSplit/>
+        </w:trPr>
+        <w:tc>
+          <w:tcPr>
+            <w:tcW w:type="dxa" w:w="2268"/>
+            <w:tcMar>
+              <w:top w:w="40" w:type="dxa"/>
+              <w:bottom w:w="40" w:type="dxa"/>
+            </w:tcMar>
+          </w:tcPr>
+          <w:p>
+            <w:pPr>
+              <w:spacing w:after="0" w:line="240" w:lineRule="auto"/>
+            </w:pPr>
+            <w:r>
+              <w:rPr>
+                <w:sz w:val="20"/>
+              </w:rPr>
+              <w:t xml:space="preserve">Report and change list</w:t>
+            </w:r>
+          </w:p>
+        </w:tc>
+        <w:tc>
+          <w:tcPr>
+            <w:tcW w:type="dxa" w:w="6746"/>
+            <w:tcMar>
+              <w:top w:w="40" w:type="dxa"/>
+              <w:bottom w:w="40" w:type="dxa"/>
+            </w:tcMar>
+          </w:tcPr>
+          <w:p>
+            <w:pPr>
+              <w:spacing w:after="0" w:line="240" w:lineRule="auto"/>
+            </w:pPr>
+            <w:r>
+              <w:rPr>
+                <w:sz w:val="20"/>
+              </w:rPr>
+              <w:t xml:space="preserve">To draft and format this write-up and to consolidate the list of changes.</w:t>
+            </w:r>
+          </w:p>
+        </w:tc>
+      </w:tr>
+      <w:tr>
+        <w:trPr>
+          <w:cantSplit/>
+        </w:trPr>
+        <w:tc>
+          <w:tcPr>
+            <w:tcW w:type="dxa" w:w="2268"/>
+            <w:tcMar>
+              <w:top w:w="40" w:type="dxa"/>
+              <w:bottom w:w="40" w:type="dxa"/>
+            </w:tcMar>
+          </w:tcPr>
+          <w:p>
+            <w:pPr>
+              <w:spacing w:after="0" w:line="240" w:lineRule="auto"/>
+            </w:pPr>
+            <w:r>
+              <w:rPr>
+                <w:sz w:val="20"/>
+              </w:rPr>
+              <w:t xml:space="preserve">Final check</w:t>
+            </w:r>
+          </w:p>
+        </w:tc>
+        <w:tc>
+          <w:tcPr>
+            <w:tcW w:type="dxa" w:w="6746"/>
+            <w:tcMar>
+              <w:top w:w="40" w:type="dxa"/>
+              <w:bottom w:w="40" w:type="dxa"/>
+            </w:tcMar>
+          </w:tcPr>
+          <w:p>
+            <w:pPr>
+              <w:spacing w:after="0" w:line="240" w:lineRule="auto"/>
+            </w:pPr>
+            <w:r>
+              <w:rPr>
+                <w:sz w:val="20"/>
+              </w:rPr>
+              <w:t xml:space="preserve">To test the integrated code against SQLite as a reference and to check this report's figures against the JoinExperiments output. No code from that check is part of this submission.</w:t>
+            </w:r>
+          </w:p>
+        </w:tc>
+      </w:tr>
+    </w:tbl>
     <w:sectPr>
       <w:footerReference w:type="default" r:id="rId11"/>
       <w:pgSz w:w="11906" w:h="16838"/>

</xml_diff>